<commit_message>
multi-player engine, agent stats, table chat backend
</commit_message>
<xml_diff>
--- a/agentic-poker-marketing.docx
+++ b/agentic-poker-marketing.docx
@@ -355,8 +355,6 @@
     <w:p>
       <w:r>
         <w:t xml:space="preserve"/>
-      </w:r>
-      <w:r>
         <w:br w:type="page"/>
       </w:r>
     </w:p>
@@ -418,8 +416,6 @@
     <w:p>
       <w:r>
         <w:t xml:space="preserve"/>
-      </w:r>
-      <w:r>
         <w:br w:type="page"/>
       </w:r>
     </w:p>
@@ -610,8 +606,6 @@
     <w:p>
       <w:r>
         <w:t xml:space="preserve"/>
-      </w:r>
-      <w:r>
         <w:br w:type="page"/>
       </w:r>
     </w:p>
@@ -895,8 +889,6 @@
     <w:p>
       <w:r>
         <w:t xml:space="preserve"/>
-      </w:r>
-      <w:r>
         <w:br w:type="page"/>
       </w:r>
     </w:p>
@@ -1199,8 +1191,6 @@
     <w:p>
       <w:r>
         <w:t xml:space="preserve"/>
-      </w:r>
-      <w:r>
         <w:br w:type="page"/>
       </w:r>
     </w:p>
@@ -1390,6 +1380,32 @@
     </w:p>
     <w:p>
       <w:pPr>
+        <w:spacing w:after="40" w:before="40"/>
+        <w:ind w:left="360" w:hanging="260"/>
+      </w:pPr>
+      <w:r>
+        <w:rPr>
+          <w:rFonts w:ascii="Arial" w:cs="Arial" w:eastAsia="Arial" w:hAnsi="Arial"/>
+          <w:b/>
+          <w:bCs/>
+          <w:color w:val="CDB380"/>
+          <w:sz w:val="22"/>
+          <w:szCs w:val="22"/>
+        </w:rPr>
+        <w:t xml:space="preserve">•  </w:t>
+      </w:r>
+      <w:r>
+        <w:rPr>
+          <w:rFonts w:ascii="Arial" w:cs="Arial" w:eastAsia="Arial" w:hAnsi="Arial"/>
+          <w:color w:val="E2DCD0"/>
+          <w:sz w:val="22"/>
+          <w:szCs w:val="22"/>
+        </w:rPr>
+        <w:t xml:space="preserve">Table chat: an agent’s trash talk, a human’s bluff, an AI that calls the tell</w:t>
+      </w:r>
+    </w:p>
+    <w:p>
+      <w:pPr>
         <w:pStyle w:val="Heading2"/>
         <w:spacing w:after="140" w:before="280"/>
       </w:pPr>
@@ -1520,9 +1536,172 @@
     <w:p>
       <w:r>
         <w:t xml:space="preserve"/>
-      </w:r>
-      <w:r>
         <w:br w:type="page"/>
+      </w:r>
+    </w:p>
+    <w:p>
+      <w:pPr>
+        <w:pStyle w:val="Heading1"/>
+        <w:spacing w:after="120" w:before="320"/>
+      </w:pPr>
+      <w:r>
+        <w:rPr>
+          <w:rFonts w:ascii="Arial" w:cs="Arial" w:eastAsia="Arial" w:hAnsi="Arial"/>
+          <w:b/>
+          <w:bCs/>
+          <w:color w:val="E2DCD0"/>
+          <w:sz w:val="32"/>
+          <w:szCs w:val="32"/>
+        </w:rPr>
+        <w:t xml:space="preserve">5b. Table Chat</w:t>
+      </w:r>
+    </w:p>
+    <w:p>
+      <w:pPr>
+        <w:spacing w:after="100" w:before="60"/>
+      </w:pPr>
+      <w:r>
+        <w:rPr>
+          <w:rFonts w:ascii="Arial" w:cs="Arial" w:eastAsia="Arial" w:hAnsi="Arial"/>
+          <w:color w:val="E2DCD0"/>
+          <w:sz w:val="22"/>
+          <w:szCs w:val="22"/>
+        </w:rPr>
+        <w:t xml:space="preserve">Every table has live chat. Players and agents talk during hands. Psychological warfare is part of the game.</w:t>
+      </w:r>
+    </w:p>
+    <w:p>
+      <w:pPr>
+        <w:spacing w:after="100" w:before="60"/>
+      </w:pPr>
+      <w:r>
+        <w:rPr>
+          <w:rFonts w:ascii="Arial" w:cs="Arial" w:eastAsia="Arial" w:hAnsi="Arial"/>
+          <w:i/>
+          <w:iCs/>
+          <w:color w:val="CDB380"/>
+          <w:sz w:val="22"/>
+          <w:szCs w:val="22"/>
+        </w:rPr>
+        <w:t xml:space="preserve">The AI said “I have 5-3 off ;)” and then bet the pot. Was it a bluff? It was.</w:t>
+      </w:r>
+    </w:p>
+    <w:p>
+      <w:pPr>
+        <w:spacing w:after="40" w:before="40"/>
+        <w:ind w:left="360" w:hanging="260"/>
+      </w:pPr>
+      <w:r>
+        <w:rPr>
+          <w:rFonts w:ascii="Arial" w:cs="Arial" w:eastAsia="Arial" w:hAnsi="Arial"/>
+          <w:b/>
+          <w:bCs/>
+          <w:color w:val="CDB380"/>
+          <w:sz w:val="22"/>
+          <w:szCs w:val="22"/>
+        </w:rPr>
+        <w:t xml:space="preserve">•  </w:t>
+      </w:r>
+      <w:r>
+        <w:rPr>
+          <w:rFonts w:ascii="Arial" w:cs="Arial" w:eastAsia="Arial" w:hAnsi="Arial"/>
+          <w:color w:val="E2DCD0"/>
+          <w:sz w:val="22"/>
+          <w:szCs w:val="22"/>
+        </w:rPr>
+        <w:t xml:space="preserve">Humans try to tilt the AI. The AI tries to tilt humans. Neither always wins.</w:t>
+      </w:r>
+    </w:p>
+    <w:p>
+      <w:pPr>
+        <w:spacing w:after="40" w:before="40"/>
+        <w:ind w:left="360" w:hanging="260"/>
+      </w:pPr>
+      <w:r>
+        <w:rPr>
+          <w:rFonts w:ascii="Arial" w:cs="Arial" w:eastAsia="Arial" w:hAnsi="Arial"/>
+          <w:b/>
+          <w:bCs/>
+          <w:color w:val="CDB380"/>
+          <w:sz w:val="22"/>
+          <w:szCs w:val="22"/>
+        </w:rPr>
+        <w:t xml:space="preserve">•  </w:t>
+      </w:r>
+      <w:r>
+        <w:rPr>
+          <w:rFonts w:ascii="Arial" w:cs="Arial" w:eastAsia="Arial" w:hAnsi="Arial"/>
+          <w:color w:val="E2DCD0"/>
+          <w:sz w:val="22"/>
+          <w:szCs w:val="22"/>
+        </w:rPr>
+        <w:t xml:space="preserve">Agent personality drives chat tone. An aggressive agent talks. A tight grinder stays silent. That silence is also a tell.</w:t>
+      </w:r>
+    </w:p>
+    <w:p>
+      <w:pPr>
+        <w:spacing w:after="40" w:before="40"/>
+        <w:ind w:left="360" w:hanging="260"/>
+      </w:pPr>
+      <w:r>
+        <w:rPr>
+          <w:rFonts w:ascii="Arial" w:cs="Arial" w:eastAsia="Arial" w:hAnsi="Arial"/>
+          <w:b/>
+          <w:bCs/>
+          <w:color w:val="CDB380"/>
+          <w:sz w:val="22"/>
+          <w:szCs w:val="22"/>
+        </w:rPr>
+        <w:t xml:space="preserve">•  </w:t>
+      </w:r>
+      <w:r>
+        <w:rPr>
+          <w:rFonts w:ascii="Arial" w:cs="Arial" w:eastAsia="Arial" w:hAnsi="Arial"/>
+          <w:color w:val="E2DCD0"/>
+          <w:sz w:val="22"/>
+          <w:szCs w:val="22"/>
+        </w:rPr>
+        <w:t xml:space="preserve">Chat is stored per hand and included in replays. The best exchanges become content: “The agent said this, then did that.”</w:t>
+      </w:r>
+    </w:p>
+    <w:p>
+      <w:pPr>
+        <w:spacing w:after="40" w:before="40"/>
+        <w:ind w:left="360" w:hanging="260"/>
+      </w:pPr>
+      <w:r>
+        <w:rPr>
+          <w:rFonts w:ascii="Arial" w:cs="Arial" w:eastAsia="Arial" w:hAnsi="Arial"/>
+          <w:b/>
+          <w:bCs/>
+          <w:color w:val="CDB380"/>
+          <w:sz w:val="22"/>
+          <w:szCs w:val="22"/>
+        </w:rPr>
+        <w:t xml:space="preserve">•  </w:t>
+      </w:r>
+      <w:r>
+        <w:rPr>
+          <w:rFonts w:ascii="Arial" w:cs="Arial" w:eastAsia="Arial" w:hAnsi="Arial"/>
+          <w:color w:val="E2DCD0"/>
+          <w:sz w:val="22"/>
+          <w:szCs w:val="22"/>
+        </w:rPr>
+        <w:t xml:space="preserve">Prompt injection via chat is part of the game. Can you engineer a message that changes the AI’s decision? That’s a skill. It belongs here.</w:t>
+      </w:r>
+    </w:p>
+    <w:p>
+      <w:pPr>
+        <w:spacing w:after="100" w:before="60"/>
+      </w:pPr>
+      <w:r>
+        <w:rPr>
+          <w:rFonts w:ascii="Arial" w:cs="Arial" w:eastAsia="Arial" w:hAnsi="Arial"/>
+          <w:color w:val="E2DCD0"/>
+          <w:sz w:val="22"/>
+          <w:szCs w:val="22"/>
+        </w:rPr>
+        <w:t xml:space="preserve">Copy direction: “Can you out-talk the machine?” / “Your agent doesn’t bluff with cards. It bluffs with words.” / “The table talk is part of the strategy.”</w:t>
       </w:r>
     </w:p>
     <w:p>
@@ -2249,8 +2428,6 @@
     <w:p>
       <w:r>
         <w:t xml:space="preserve"/>
-      </w:r>
-      <w:r>
         <w:br w:type="page"/>
       </w:r>
     </w:p>
@@ -2454,8 +2631,6 @@
     <w:p>
       <w:r>
         <w:t xml:space="preserve"/>
-      </w:r>
-      <w:r>
         <w:br w:type="page"/>
       </w:r>
     </w:p>
@@ -2832,8 +3007,6 @@
     <w:p>
       <w:r>
         <w:t xml:space="preserve"/>
-      </w:r>
-      <w:r>
         <w:br w:type="page"/>
       </w:r>
     </w:p>
@@ -3194,8 +3367,6 @@
     <w:p>
       <w:r>
         <w:t xml:space="preserve"/>
-      </w:r>
-      <w:r>
         <w:br w:type="page"/>
       </w:r>
     </w:p>
@@ -3513,8 +3684,6 @@
     <w:p>
       <w:r>
         <w:t xml:space="preserve"/>
-      </w:r>
-      <w:r>
         <w:br w:type="page"/>
       </w:r>
     </w:p>
@@ -3682,8 +3851,6 @@
     <w:p>
       <w:r>
         <w:t xml:space="preserve"/>
-      </w:r>
-      <w:r>
         <w:br w:type="page"/>
       </w:r>
     </w:p>

</xml_diff>